<commit_message>
fix: reformatar DOCX convertidos com estilo UNIR profissional
- Fonte Arial, margens 2.54cm, cores da marca (#1A365D, #4A5568, #2D3748)
- Títulos 48pt bold centrados, subtítulos 18pt
- Subtítulos de secção 13pt bold #1A365D
- Corpo 12pt justificado line-height 1.15
- Listas com bullets formatadas
- Bold inline preservado em todos os parágrafos
</commit_message>
<xml_diff>
--- a/apps/web/docs/whitepapers/UNIR_Eixo_I_Anexo_B_Alternativas_Minerais.docx
+++ b/apps/web/docs/whitepapers/UNIR_Eixo_I_Anexo_B_Alternativas_Minerais.docx
@@ -3,413 +3,1063 @@
 <w:document xmlns:wpc="http://schemas.microsoft.com/office/word/2010/wordprocessingCanvas" xmlns:mo="http://schemas.microsoft.com/office/mac/office/2008/main" xmlns:mc="http://schemas.openxmlformats.org/markup-compatibility/2006" xmlns:mv="urn:schemas-microsoft-com:mac:vml" xmlns:o="urn:schemas-microsoft-com:office:office" xmlns:r="http://schemas.openxmlformats.org/officeDocument/2006/relationships" xmlns:m="http://schemas.openxmlformats.org/officeDocument/2006/math" xmlns:v="urn:schemas-microsoft-com:vml" xmlns:wp14="http://schemas.microsoft.com/office/word/2010/wordprocessingDrawing" xmlns:wp="http://schemas.openxmlformats.org/drawingml/2006/wordprocessingDrawing" xmlns:w10="urn:schemas-microsoft-com:office:word" xmlns:w="http://schemas.openxmlformats.org/wordprocessingml/2006/main" xmlns:w14="http://schemas.microsoft.com/office/word/2010/wordml" xmlns:wpg="http://schemas.microsoft.com/office/word/2010/wordprocessingGroup" xmlns:wpi="http://schemas.microsoft.com/office/word/2010/wordprocessingInk" xmlns:wne="http://schemas.microsoft.com/office/word/2006/wordml" xmlns:wps="http://schemas.microsoft.com/office/word/2010/wordprocessingShape" mc:Ignorable="w14 wp14">
   <w:body>
     <w:p>
+      <w:pPr>
+        <w:jc w:val="center"/>
+      </w:pPr>
       <w:r>
+        <w:rPr>
+          <w:rFonts w:ascii="Arial" w:hAnsi="Arial"/>
+          <w:b/>
+          <w:color w:val="1A365D"/>
+          <w:sz w:val="96"/>
+        </w:rPr>
+        <w:t>Alternativas à Mineração Marinha</w:t>
+      </w:r>
+    </w:p>
+    <w:p>
+      <w:pPr>
+        <w:jc w:val="center"/>
+      </w:pPr>
+      <w:r>
+        <w:rPr>
+          <w:rFonts w:ascii="Arial" w:hAnsi="Arial"/>
+          <w:b/>
+          <w:color w:val="4A5568"/>
+          <w:sz w:val="36"/>
+        </w:rPr>
+        <w:t>Urban Mining, Biotecnologia e Deep-Sea Tech</w:t>
+      </w:r>
+    </w:p>
+    <w:p/>
+    <w:p>
+      <w:pPr>
+        <w:spacing w:line="276" w:lineRule="auto"/>
+        <w:jc w:val="both"/>
+      </w:pPr>
+      <w:r>
+        <w:rPr>
+          <w:rFonts w:ascii="Arial" w:hAnsi="Arial"/>
+          <w:color w:val="2D3748"/>
+          <w:sz w:val="24"/>
+        </w:rPr>
         <w:t>﻿UNIR</w:t>
       </w:r>
     </w:p>
     <w:p>
       <w:r>
+        <w:rPr>
+          <w:rFonts w:ascii="Arial" w:hAnsi="Arial"/>
+          <w:b/>
+          <w:color w:val="1A365D"/>
+          <w:sz w:val="24"/>
+        </w:rPr>
         <w:t>Eixo I - Soberania, Defesa e Mar</w:t>
       </w:r>
     </w:p>
     <w:p>
+      <w:pPr>
+        <w:spacing w:line="276" w:lineRule="auto"/>
+        <w:jc w:val="both"/>
+      </w:pPr>
       <w:r>
+        <w:rPr>
+          <w:rFonts w:ascii="Arial" w:hAnsi="Arial"/>
+          <w:color w:val="2D3748"/>
+          <w:sz w:val="24"/>
+        </w:rPr>
         <w:t>ANEXO B - Alternativas Estratégicas à Mineração em Mar Profundo</w:t>
       </w:r>
     </w:p>
     <w:p>
+      <w:pPr>
+        <w:spacing w:line="276" w:lineRule="auto"/>
+        <w:jc w:val="both"/>
+      </w:pPr>
       <w:r>
+        <w:rPr>
+          <w:rFonts w:ascii="Arial" w:hAnsi="Arial"/>
+          <w:color w:val="2D3748"/>
+          <w:sz w:val="24"/>
+        </w:rPr>
         <w:t>Documento Anexo Oficial | Versão 1.0 | 27 January 2026</w:t>
       </w:r>
     </w:p>
     <w:p>
+      <w:pPr>
+        <w:spacing w:line="276" w:lineRule="auto"/>
+        <w:jc w:val="both"/>
+      </w:pPr>
       <w:r>
+        <w:rPr>
+          <w:rFonts w:ascii="Arial" w:hAnsi="Arial"/>
+          <w:color w:val="2D3748"/>
+          <w:sz w:val="24"/>
+        </w:rPr>
         <w:t>Âmbito: Complementar ao Plano 'Portugal 90%'. Mantém a moratória nacional até 2050; exceções apenas para investigação científica/tecnológica, sem exploração comercial.</w:t>
       </w:r>
     </w:p>
     <w:p>
       <w:r>
+        <w:rPr>
+          <w:rFonts w:ascii="Arial" w:hAnsi="Arial"/>
+          <w:b/>
+          <w:color w:val="1A365D"/>
+          <w:sz w:val="24"/>
+        </w:rPr>
         <w:t>Resumo executivo</w:t>
       </w:r>
     </w:p>
     <w:p>
+      <w:pPr>
+        <w:spacing w:line="276" w:lineRule="auto"/>
+        <w:jc w:val="both"/>
+      </w:pPr>
       <w:r>
+        <w:rPr>
+          <w:rFonts w:ascii="Arial" w:hAnsi="Arial"/>
+          <w:color w:val="2D3748"/>
+          <w:sz w:val="24"/>
+        </w:rPr>
         <w:t>Este Anexo B detalha alternativas estratégicas à mineração comercial em mar profundo, alinhadas com a posição do UNIR: proteger o oceano, exercer soberania com tecnologia e gerar valor económico real. A análise contextualiza a situação atual em Portugal, identifica lacunas e oportunidades, compara custos e ganhos e propõe um roteiro adaptado aos hábitos e incentivos do país.</w:t>
       </w:r>
     </w:p>
     <w:p>
+      <w:pPr>
+        <w:spacing w:line="276" w:lineRule="auto"/>
+        <w:jc w:val="both"/>
+      </w:pPr>
       <w:r>
+        <w:rPr>
+          <w:rFonts w:ascii="Arial" w:hAnsi="Arial"/>
+          <w:color w:val="2D3748"/>
+          <w:sz w:val="24"/>
+        </w:rPr>
         <w:t>Conclusão central: Portugal pode capturar valor económico, segurança de abastecimento e influência geopolítica sem recorrer à extração comercial em mar profundo no curto e médio prazo, priorizando (i) Urban Mining e reciclagem avançada, (ii) Biotecnologia marinha de alto valor, (iii) Tecnologia de mar profundo (robótica, mapeamento, dados) como indústria exportadora.</w:t>
       </w:r>
     </w:p>
+    <w:p/>
     <w:p>
       <w:r>
-        <w:t>________________</w:t>
-      </w:r>
-    </w:p>
-    <w:p>
-      <w:r>
+        <w:rPr>
+          <w:rFonts w:ascii="Arial" w:hAnsi="Arial"/>
+          <w:b/>
+          <w:color w:val="1A365D"/>
+          <w:sz w:val="24"/>
+        </w:rPr>
         <w:t>1. Contexto: onde estamos hoje</w:t>
       </w:r>
     </w:p>
     <w:p>
+      <w:pPr>
+        <w:spacing w:line="276" w:lineRule="auto"/>
+        <w:jc w:val="both"/>
+      </w:pPr>
       <w:r>
+        <w:rPr>
+          <w:rFonts w:ascii="Arial" w:hAnsi="Arial"/>
+          <w:color w:val="2D3748"/>
+          <w:sz w:val="24"/>
+        </w:rPr>
         <w:t>Portugal apresenta um desfasamento relevante face à União Europeia na recolha de resíduos de equipamentos elétricos e eletrónicos (REEE). A recolha per capita nacional situa-se significativamente abaixo da média europeia, refletindo hábitos de retenção doméstica (equipamentos guardados) e fricção nos sistemas de entrega.</w:t>
       </w:r>
     </w:p>
     <w:p>
+      <w:pPr>
+        <w:spacing w:line="276" w:lineRule="auto"/>
+        <w:jc w:val="both"/>
+      </w:pPr>
       <w:r>
+        <w:rPr>
+          <w:rFonts w:ascii="Arial" w:hAnsi="Arial"/>
+          <w:color w:val="2D3748"/>
+          <w:sz w:val="24"/>
+        </w:rPr>
         <w:t>Em paralelo, o país dispõe de ativos estratégicos: portos atlânticos, posição logística, capacidade científica no mar, e enquadramento político que privilegia precaução ambiental (moratória de mineração em mar profundo até 2050).</w:t>
       </w:r>
     </w:p>
     <w:p>
       <w:r>
+        <w:rPr>
+          <w:rFonts w:ascii="Arial" w:hAnsi="Arial"/>
+          <w:b/>
+          <w:color w:val="1A365D"/>
+          <w:sz w:val="24"/>
+        </w:rPr>
         <w:t>1.1. O problema real (diagnóstico)</w:t>
       </w:r>
     </w:p>
     <w:p>
+      <w:pPr>
+        <w:pStyle w:val="ListBullet"/>
+        <w:spacing w:line="276" w:lineRule="auto"/>
+        <w:jc w:val="both"/>
+      </w:pPr>
       <w:r>
-        <w:t>* Valor económico imobilizado em resíduos eletrónicos e baterias.</w:t>
+        <w:rPr>
+          <w:rFonts w:ascii="Arial" w:hAnsi="Arial"/>
+          <w:color w:val="2D3748"/>
+          <w:sz w:val="24"/>
+        </w:rPr>
+        <w:t>Valor económico imobilizado em resíduos eletrónicos e baterias.</w:t>
+      </w:r>
+    </w:p>
+    <w:p>
+      <w:pPr>
+        <w:pStyle w:val="ListBullet"/>
+        <w:spacing w:line="276" w:lineRule="auto"/>
+        <w:jc w:val="both"/>
+      </w:pPr>
+      <w:r>
+        <w:rPr>
+          <w:rFonts w:ascii="Arial" w:hAnsi="Arial"/>
+          <w:color w:val="2D3748"/>
+          <w:sz w:val="24"/>
+        </w:rPr>
+        <w:t>Dependência externa de metais críticos e cadeias de refinação.</w:t>
+      </w:r>
+    </w:p>
+    <w:p>
+      <w:pPr>
+        <w:pStyle w:val="ListBullet"/>
+        <w:spacing w:line="276" w:lineRule="auto"/>
+        <w:jc w:val="both"/>
+      </w:pPr>
+      <w:r>
+        <w:rPr>
+          <w:rFonts w:ascii="Arial" w:hAnsi="Arial"/>
+          <w:color w:val="2D3748"/>
+          <w:sz w:val="24"/>
+        </w:rPr>
+        <w:t>Baixa conversão de ciência em indústria e exportação.</w:t>
+      </w:r>
+    </w:p>
+    <w:p>
+      <w:pPr>
+        <w:pStyle w:val="ListBullet"/>
+        <w:spacing w:line="276" w:lineRule="auto"/>
+        <w:jc w:val="both"/>
+      </w:pPr>
+      <w:r>
+        <w:rPr>
+          <w:rFonts w:ascii="Arial" w:hAnsi="Arial"/>
+          <w:color w:val="2D3748"/>
+          <w:sz w:val="24"/>
+        </w:rPr>
+        <w:t>Risco reputacional e ambiental associado à mineração oceânica precoce.</w:t>
       </w:r>
     </w:p>
     <w:p>
       <w:r>
-        <w:t>* Dependência externa de metais críticos e cadeias de refinação.</w:t>
-      </w:r>
-    </w:p>
-    <w:p>
-      <w:r>
-        <w:t>* Baixa conversão de ciência em indústria e exportação.</w:t>
-      </w:r>
-    </w:p>
-    <w:p>
-      <w:r>
-        <w:t>* Risco reputacional e ambiental associado à mineração oceânica precoce.</w:t>
-      </w:r>
-    </w:p>
-    <w:p>
-      <w:r>
+        <w:rPr>
+          <w:rFonts w:ascii="Arial" w:hAnsi="Arial"/>
+          <w:b/>
+          <w:color w:val="1A365D"/>
+          <w:sz w:val="24"/>
+        </w:rPr>
         <w:t>1.2. O objetivo estratégico do UNIR</w:t>
       </w:r>
     </w:p>
     <w:p>
+      <w:pPr>
+        <w:spacing w:line="276" w:lineRule="auto"/>
+        <w:jc w:val="both"/>
+      </w:pPr>
       <w:r>
+        <w:rPr>
+          <w:rFonts w:ascii="Arial" w:hAnsi="Arial"/>
+          <w:color w:val="2D3748"/>
+          <w:sz w:val="24"/>
+        </w:rPr>
         <w:t>Transformar resíduos, conhecimento e tecnologia em soberania económica e segurança, criando valor mensurável para as pessoas e para o país, sem comprometer ecossistemas marinhos nem gerar conflitos políticos desnecessários.</w:t>
       </w:r>
     </w:p>
     <w:p>
       <w:r>
+        <w:rPr>
+          <w:rFonts w:ascii="Arial" w:hAnsi="Arial"/>
+          <w:b/>
+          <w:color w:val="1A365D"/>
+          <w:sz w:val="24"/>
+        </w:rPr>
         <w:t>2. Alternativa A - Urban Mining (mineração urbana)</w:t>
       </w:r>
     </w:p>
     <w:p>
+      <w:pPr>
+        <w:spacing w:line="276" w:lineRule="auto"/>
+        <w:jc w:val="both"/>
+      </w:pPr>
       <w:r>
+        <w:rPr>
+          <w:rFonts w:ascii="Arial" w:hAnsi="Arial"/>
+          <w:color w:val="2D3748"/>
+          <w:sz w:val="24"/>
+        </w:rPr>
         <w:t>Urban Mining refere-se à recuperação avançada de metais críticos e estratégicos a partir de resíduos urbanos: baterias, equipamentos eletrónicos, veículos elétricos e infraestruturas industriais.</w:t>
       </w:r>
     </w:p>
     <w:p>
       <w:r>
+        <w:rPr>
+          <w:rFonts w:ascii="Arial" w:hAnsi="Arial"/>
+          <w:b/>
+          <w:color w:val="1A365D"/>
+          <w:sz w:val="24"/>
+        </w:rPr>
         <w:t>2.1. O que temos hoje</w:t>
       </w:r>
     </w:p>
     <w:p>
+      <w:pPr>
+        <w:pStyle w:val="ListBullet"/>
+        <w:spacing w:line="276" w:lineRule="auto"/>
+        <w:jc w:val="both"/>
+      </w:pPr>
       <w:r>
-        <w:t>* Recolha per capita de REEE inferior à média da UE.</w:t>
+        <w:rPr>
+          <w:rFonts w:ascii="Arial" w:hAnsi="Arial"/>
+          <w:color w:val="2D3748"/>
+          <w:sz w:val="24"/>
+        </w:rPr>
+        <w:t>Recolha per capita de REEE inferior à média da UE.</w:t>
+      </w:r>
+    </w:p>
+    <w:p>
+      <w:pPr>
+        <w:pStyle w:val="ListBullet"/>
+        <w:spacing w:line="276" w:lineRule="auto"/>
+        <w:jc w:val="both"/>
+      </w:pPr>
+      <w:r>
+        <w:rPr>
+          <w:rFonts w:ascii="Arial" w:hAnsi="Arial"/>
+          <w:color w:val="2D3748"/>
+          <w:sz w:val="24"/>
+        </w:rPr>
+        <w:t>Infraestruturas de tratamento existentes, mas subaproveitadas.</w:t>
+      </w:r>
+    </w:p>
+    <w:p>
+      <w:pPr>
+        <w:pStyle w:val="ListBullet"/>
+        <w:spacing w:line="276" w:lineRule="auto"/>
+        <w:jc w:val="both"/>
+      </w:pPr>
+      <w:r>
+        <w:rPr>
+          <w:rFonts w:ascii="Arial" w:hAnsi="Arial"/>
+          <w:color w:val="2D3748"/>
+          <w:sz w:val="24"/>
+        </w:rPr>
+        <w:t>Baixa atratividade para o cidadão entregar pequenos equipamentos.</w:t>
       </w:r>
     </w:p>
     <w:p>
       <w:r>
-        <w:t>* Infraestruturas de tratamento existentes, mas subaproveitadas.</w:t>
+        <w:rPr>
+          <w:rFonts w:ascii="Arial" w:hAnsi="Arial"/>
+          <w:b/>
+          <w:color w:val="1A365D"/>
+          <w:sz w:val="24"/>
+        </w:rPr>
+        <w:t>2.2. O que podemos ter</w:t>
+      </w:r>
+    </w:p>
+    <w:p>
+      <w:pPr>
+        <w:pStyle w:val="ListBullet"/>
+        <w:spacing w:line="276" w:lineRule="auto"/>
+        <w:jc w:val="both"/>
+      </w:pPr>
+      <w:r>
+        <w:rPr>
+          <w:rFonts w:ascii="Arial" w:hAnsi="Arial"/>
+          <w:color w:val="2D3748"/>
+          <w:sz w:val="24"/>
+        </w:rPr>
+        <w:t>Portugal como hub europeu de reciclagem e refinação limpa de metais críticos.</w:t>
+      </w:r>
+    </w:p>
+    <w:p>
+      <w:pPr>
+        <w:pStyle w:val="ListBullet"/>
+        <w:spacing w:line="276" w:lineRule="auto"/>
+        <w:jc w:val="both"/>
+      </w:pPr>
+      <w:r>
+        <w:rPr>
+          <w:rFonts w:ascii="Arial" w:hAnsi="Arial"/>
+          <w:color w:val="2D3748"/>
+          <w:sz w:val="24"/>
+        </w:rPr>
+        <w:t>Cadeias industriais de valor (separação, refinação, reutilização).</w:t>
+      </w:r>
+    </w:p>
+    <w:p>
+      <w:pPr>
+        <w:pStyle w:val="ListBullet"/>
+        <w:spacing w:line="276" w:lineRule="auto"/>
+        <w:jc w:val="both"/>
+      </w:pPr>
+      <w:r>
+        <w:rPr>
+          <w:rFonts w:ascii="Arial" w:hAnsi="Arial"/>
+          <w:color w:val="2D3748"/>
+          <w:sz w:val="24"/>
+        </w:rPr>
+        <w:t>Redução de dependência externa e emissões associadas à extração primária.</w:t>
       </w:r>
     </w:p>
     <w:p>
       <w:r>
-        <w:t>* Baixa atratividade para o cidadão entregar pequenos equipamentos.</w:t>
-      </w:r>
-    </w:p>
-    <w:p>
-      <w:r>
-        <w:t>2.2. O que podemos ter</w:t>
-      </w:r>
-    </w:p>
-    <w:p>
-      <w:r>
-        <w:t>* Portugal como hub europeu de reciclagem e refinação limpa de metais críticos.</w:t>
-      </w:r>
-    </w:p>
-    <w:p>
-      <w:r>
-        <w:t>* Cadeias industriais de valor (separação, refinação, reutilização).</w:t>
-      </w:r>
-    </w:p>
-    <w:p>
-      <w:r>
-        <w:t>* Redução de dependência externa e emissões associadas à extração primária.</w:t>
-      </w:r>
-    </w:p>
-    <w:p>
-      <w:r>
+        <w:rPr>
+          <w:rFonts w:ascii="Arial" w:hAnsi="Arial"/>
+          <w:b/>
+          <w:color w:val="1A365D"/>
+          <w:sz w:val="24"/>
+        </w:rPr>
         <w:t>2.3. Custos vs ganhos (ordens de grandeza)</w:t>
       </w:r>
     </w:p>
     <w:p>
+      <w:pPr>
+        <w:spacing w:line="276" w:lineRule="auto"/>
+        <w:jc w:val="both"/>
+      </w:pPr>
       <w:r>
+        <w:rPr>
+          <w:rFonts w:ascii="Arial" w:hAnsi="Arial"/>
+          <w:color w:val="2D3748"/>
+          <w:sz w:val="24"/>
+        </w:rPr>
         <w:t>Os custos de reciclagem avançada variam por tecnologia e química, mas são significativamente inferiores ao custo ambiental e geopolítico da extração primária. Os ganhos incluem matérias-primas secundárias, emprego industrial qualificado e benefícios climáticos.</w:t>
       </w:r>
     </w:p>
     <w:p>
       <w:r>
+        <w:rPr>
+          <w:rFonts w:ascii="Arial" w:hAnsi="Arial"/>
+          <w:b/>
+          <w:color w:val="1A365D"/>
+          <w:sz w:val="24"/>
+        </w:rPr>
         <w:t>2.4. Fatores contra e respostas UNIR</w:t>
       </w:r>
     </w:p>
     <w:p>
+      <w:pPr>
+        <w:pStyle w:val="ListBullet"/>
+        <w:spacing w:line="276" w:lineRule="auto"/>
+        <w:jc w:val="both"/>
+      </w:pPr>
       <w:r>
-        <w:t>* Hábito de guardar equipamentos → Resposta: incentivos diretos (depósito-retorno) e conveniência.</w:t>
+        <w:rPr>
+          <w:rFonts w:ascii="Arial" w:hAnsi="Arial"/>
+          <w:color w:val="2D3748"/>
+          <w:sz w:val="24"/>
+        </w:rPr>
+        <w:t>Hábito de guardar equipamentos → Resposta: incentivos diretos (depósito-retorno) e conveniência.</w:t>
+      </w:r>
+    </w:p>
+    <w:p>
+      <w:pPr>
+        <w:pStyle w:val="ListBullet"/>
+        <w:spacing w:line="276" w:lineRule="auto"/>
+        <w:jc w:val="both"/>
+      </w:pPr>
+      <w:r>
+        <w:rPr>
+          <w:rFonts w:ascii="Arial" w:hAnsi="Arial"/>
+          <w:color w:val="2D3748"/>
+          <w:sz w:val="24"/>
+        </w:rPr>
+        <w:t>Risco de desvio para informal → Resposta: rastreio digital e fiscalização por dados.</w:t>
+      </w:r>
+    </w:p>
+    <w:p>
+      <w:pPr>
+        <w:pStyle w:val="ListBullet"/>
+        <w:spacing w:line="276" w:lineRule="auto"/>
+        <w:jc w:val="both"/>
+      </w:pPr>
+      <w:r>
+        <w:rPr>
+          <w:rFonts w:ascii="Arial" w:hAnsi="Arial"/>
+          <w:color w:val="2D3748"/>
+          <w:sz w:val="24"/>
+        </w:rPr>
+        <w:t>Volatilidade de preços → Resposta: foco em segurança de abastecimento e indústria, não especulação.</w:t>
       </w:r>
     </w:p>
     <w:p>
       <w:r>
-        <w:t>* Risco de desvio para informal → Resposta: rastreio digital e fiscalização por dados.</w:t>
-      </w:r>
-    </w:p>
-    <w:p>
-      <w:r>
-        <w:t>* Volatilidade de preços → Resposta: foco em segurança de abastecimento e indústria, não especulação.</w:t>
-      </w:r>
-    </w:p>
-    <w:p>
-      <w:r>
+        <w:rPr>
+          <w:rFonts w:ascii="Arial" w:hAnsi="Arial"/>
+          <w:b/>
+          <w:color w:val="1A365D"/>
+          <w:sz w:val="24"/>
+        </w:rPr>
         <w:t>3. Alternativa B - Biotecnologia marinha</w:t>
       </w:r>
     </w:p>
     <w:p>
+      <w:pPr>
+        <w:spacing w:line="276" w:lineRule="auto"/>
+        <w:jc w:val="both"/>
+      </w:pPr>
       <w:r>
+        <w:rPr>
+          <w:rFonts w:ascii="Arial" w:hAnsi="Arial"/>
+          <w:color w:val="2D3748"/>
+          <w:sz w:val="24"/>
+        </w:rPr>
         <w:t>A biotecnologia marinha explora organismos oceânicos para aplicações farmacêuticas, industriais e de defesa, com elevado valor acrescentado e impacto ambiental reduzido.</w:t>
       </w:r>
     </w:p>
     <w:p>
       <w:r>
+        <w:rPr>
+          <w:rFonts w:ascii="Arial" w:hAnsi="Arial"/>
+          <w:b/>
+          <w:color w:val="1A365D"/>
+          <w:sz w:val="24"/>
+        </w:rPr>
         <w:t>3.1. O que temos hoje</w:t>
       </w:r>
     </w:p>
     <w:p>
+      <w:pPr>
+        <w:pStyle w:val="ListBullet"/>
+        <w:spacing w:line="276" w:lineRule="auto"/>
+        <w:jc w:val="both"/>
+      </w:pPr>
       <w:r>
-        <w:t>* Capacidade científica relevante em universidades e centros de investigação.</w:t>
+        <w:rPr>
+          <w:rFonts w:ascii="Arial" w:hAnsi="Arial"/>
+          <w:color w:val="2D3748"/>
+          <w:sz w:val="24"/>
+        </w:rPr>
+        <w:t>Capacidade científica relevante em universidades e centros de investigação.</w:t>
+      </w:r>
+    </w:p>
+    <w:p>
+      <w:pPr>
+        <w:pStyle w:val="ListBullet"/>
+        <w:spacing w:line="276" w:lineRule="auto"/>
+        <w:jc w:val="both"/>
+      </w:pPr>
+      <w:r>
+        <w:rPr>
+          <w:rFonts w:ascii="Arial" w:hAnsi="Arial"/>
+          <w:color w:val="2D3748"/>
+          <w:sz w:val="24"/>
+        </w:rPr>
+        <w:t>Baixa escala industrial e fraca ligação ao mercado.</w:t>
       </w:r>
     </w:p>
     <w:p>
       <w:r>
-        <w:t>* Baixa escala industrial e fraca ligação ao mercado.</w:t>
+        <w:rPr>
+          <w:rFonts w:ascii="Arial" w:hAnsi="Arial"/>
+          <w:b/>
+          <w:color w:val="1A365D"/>
+          <w:sz w:val="24"/>
+        </w:rPr>
+        <w:t>3.2. O que podemos ter</w:t>
+      </w:r>
+    </w:p>
+    <w:p>
+      <w:pPr>
+        <w:pStyle w:val="ListBullet"/>
+        <w:spacing w:line="276" w:lineRule="auto"/>
+        <w:jc w:val="both"/>
+      </w:pPr>
+      <w:r>
+        <w:rPr>
+          <w:rFonts w:ascii="Arial" w:hAnsi="Arial"/>
+          <w:color w:val="2D3748"/>
+          <w:sz w:val="24"/>
+        </w:rPr>
+        <w:t>Spin-offs e patentes em fármacos, enzimas e materiais.</w:t>
+      </w:r>
+    </w:p>
+    <w:p>
+      <w:pPr>
+        <w:pStyle w:val="ListBullet"/>
+        <w:spacing w:line="276" w:lineRule="auto"/>
+        <w:jc w:val="both"/>
+      </w:pPr>
+      <w:r>
+        <w:rPr>
+          <w:rFonts w:ascii="Arial" w:hAnsi="Arial"/>
+          <w:color w:val="2D3748"/>
+          <w:sz w:val="24"/>
+        </w:rPr>
+        <w:t>Integração com saúde, defesa e indústria farmacêutica europeia.</w:t>
       </w:r>
     </w:p>
     <w:p>
       <w:r>
-        <w:t>3.2. O que podemos ter</w:t>
-      </w:r>
-    </w:p>
-    <w:p>
-      <w:r>
-        <w:t>* Spin-offs e patentes em fármacos, enzimas e materiais.</w:t>
-      </w:r>
-    </w:p>
-    <w:p>
-      <w:r>
-        <w:t>* Integração com saúde, defesa e indústria farmacêutica europeia.</w:t>
-      </w:r>
-    </w:p>
-    <w:p>
-      <w:r>
+        <w:rPr>
+          <w:rFonts w:ascii="Arial" w:hAnsi="Arial"/>
+          <w:b/>
+          <w:color w:val="1A365D"/>
+          <w:sz w:val="24"/>
+        </w:rPr>
         <w:t>3.3. Riscos e mitigação</w:t>
       </w:r>
     </w:p>
     <w:p>
+      <w:pPr>
+        <w:spacing w:line="276" w:lineRule="auto"/>
+        <w:jc w:val="both"/>
+      </w:pPr>
       <w:r>
+        <w:rPr>
+          <w:rFonts w:ascii="Arial" w:hAnsi="Arial"/>
+          <w:color w:val="2D3748"/>
+          <w:sz w:val="24"/>
+        </w:rPr>
         <w:t>Ciclos longos e risco tecnológico exigem governação rigorosa. O UNIR propõe financiamento faseado por marcos (stage-gate), com encerramento rápido de projetos sem tração.</w:t>
       </w:r>
     </w:p>
     <w:p>
       <w:r>
+        <w:rPr>
+          <w:rFonts w:ascii="Arial" w:hAnsi="Arial"/>
+          <w:b/>
+          <w:color w:val="1A365D"/>
+          <w:sz w:val="24"/>
+        </w:rPr>
         <w:t>4. Alternativa C - Tecnologia de mar profundo (Deep-Sea Tech)</w:t>
       </w:r>
     </w:p>
     <w:p>
+      <w:pPr>
+        <w:spacing w:line="276" w:lineRule="auto"/>
+        <w:jc w:val="both"/>
+      </w:pPr>
       <w:r>
+        <w:rPr>
+          <w:rFonts w:ascii="Arial" w:hAnsi="Arial"/>
+          <w:color w:val="2D3748"/>
+          <w:sz w:val="24"/>
+        </w:rPr>
         <w:t>A tecnologia de mar profundo inclui robótica submarina, mapeamento, sensores, comunicações e dados oceânicos. É um multiplicador de soberania: serve ciência, economia e defesa.</w:t>
       </w:r>
     </w:p>
     <w:p>
       <w:r>
+        <w:rPr>
+          <w:rFonts w:ascii="Arial" w:hAnsi="Arial"/>
+          <w:b/>
+          <w:color w:val="1A365D"/>
+          <w:sz w:val="24"/>
+        </w:rPr>
         <w:t>4.1. O que temos hoje</w:t>
       </w:r>
     </w:p>
     <w:p>
+      <w:pPr>
+        <w:pStyle w:val="ListBullet"/>
+        <w:spacing w:line="276" w:lineRule="auto"/>
+        <w:jc w:val="both"/>
+      </w:pPr>
       <w:r>
-        <w:t>* Competência científica dispersa.</w:t>
+        <w:rPr>
+          <w:rFonts w:ascii="Arial" w:hAnsi="Arial"/>
+          <w:color w:val="2D3748"/>
+          <w:sz w:val="24"/>
+        </w:rPr>
+        <w:t>Competência científica dispersa.</w:t>
+      </w:r>
+    </w:p>
+    <w:p>
+      <w:pPr>
+        <w:pStyle w:val="ListBullet"/>
+        <w:spacing w:line="276" w:lineRule="auto"/>
+        <w:jc w:val="both"/>
+      </w:pPr>
+      <w:r>
+        <w:rPr>
+          <w:rFonts w:ascii="Arial" w:hAnsi="Arial"/>
+          <w:color w:val="2D3748"/>
+          <w:sz w:val="24"/>
+        </w:rPr>
+        <w:t>Dependência de tecnologia estrangeira para campanhas e operações.</w:t>
       </w:r>
     </w:p>
     <w:p>
       <w:r>
-        <w:t>* Dependência de tecnologia estrangeira para campanhas e operações.</w:t>
+        <w:rPr>
+          <w:rFonts w:ascii="Arial" w:hAnsi="Arial"/>
+          <w:b/>
+          <w:color w:val="1A365D"/>
+          <w:sz w:val="24"/>
+        </w:rPr>
+        <w:t>4.2. O que podemos ter</w:t>
+      </w:r>
+    </w:p>
+    <w:p>
+      <w:pPr>
+        <w:pStyle w:val="ListBullet"/>
+        <w:spacing w:line="276" w:lineRule="auto"/>
+        <w:jc w:val="both"/>
+      </w:pPr>
+      <w:r>
+        <w:rPr>
+          <w:rFonts w:ascii="Arial" w:hAnsi="Arial"/>
+          <w:color w:val="2D3748"/>
+          <w:sz w:val="24"/>
+        </w:rPr>
+        <w:t>Cluster nacional exportador de tecnologia e serviços.</w:t>
+      </w:r>
+    </w:p>
+    <w:p>
+      <w:pPr>
+        <w:pStyle w:val="ListBullet"/>
+        <w:spacing w:line="276" w:lineRule="auto"/>
+        <w:jc w:val="both"/>
+      </w:pPr>
+      <w:r>
+        <w:rPr>
+          <w:rFonts w:ascii="Arial" w:hAnsi="Arial"/>
+          <w:color w:val="2D3748"/>
+          <w:sz w:val="24"/>
+        </w:rPr>
+        <w:t>Integração com defesa e interceção (sensores, ISR, domínio de informação).</w:t>
       </w:r>
     </w:p>
     <w:p>
       <w:r>
-        <w:t>4.2. O que podemos ter</w:t>
-      </w:r>
-    </w:p>
-    <w:p>
-      <w:r>
-        <w:t>* Cluster nacional exportador de tecnologia e serviços.</w:t>
-      </w:r>
-    </w:p>
-    <w:p>
-      <w:r>
-        <w:t>* Integração com defesa e interceção (sensores, ISR, domínio de informação).</w:t>
-      </w:r>
-    </w:p>
-    <w:p>
-      <w:r>
+        <w:rPr>
+          <w:rFonts w:ascii="Arial" w:hAnsi="Arial"/>
+          <w:b/>
+          <w:color w:val="1A365D"/>
+          <w:sz w:val="24"/>
+        </w:rPr>
         <w:t>5. Comparação estratégica</w:t>
       </w:r>
     </w:p>
     <w:p>
       <w:r>
+        <w:rPr>
+          <w:rFonts w:ascii="Arial" w:hAnsi="Arial"/>
+          <w:b/>
+          <w:color w:val="1A365D"/>
+          <w:sz w:val="24"/>
+        </w:rPr>
         <w:t>Opção</w:t>
       </w:r>
     </w:p>
     <w:p>
       <w:r>
+        <w:rPr>
+          <w:rFonts w:ascii="Arial" w:hAnsi="Arial"/>
+          <w:b/>
+          <w:color w:val="1A365D"/>
+          <w:sz w:val="24"/>
+        </w:rPr>
         <w:t>Tempo de retorno</w:t>
       </w:r>
     </w:p>
     <w:p>
       <w:r>
+        <w:rPr>
+          <w:rFonts w:ascii="Arial" w:hAnsi="Arial"/>
+          <w:b/>
+          <w:color w:val="1A365D"/>
+          <w:sz w:val="24"/>
+        </w:rPr>
         <w:t>Risco ambiental</w:t>
       </w:r>
     </w:p>
     <w:p>
       <w:r>
+        <w:rPr>
+          <w:rFonts w:ascii="Arial" w:hAnsi="Arial"/>
+          <w:b/>
+          <w:color w:val="1A365D"/>
+          <w:sz w:val="24"/>
+        </w:rPr>
         <w:t>Aceitação pública</w:t>
       </w:r>
     </w:p>
     <w:p>
       <w:r>
+        <w:rPr>
+          <w:rFonts w:ascii="Arial" w:hAnsi="Arial"/>
+          <w:b/>
+          <w:color w:val="1A365D"/>
+          <w:sz w:val="24"/>
+        </w:rPr>
         <w:t>Urban Mining</w:t>
       </w:r>
     </w:p>
     <w:p>
       <w:r>
+        <w:rPr>
+          <w:rFonts w:ascii="Arial" w:hAnsi="Arial"/>
+          <w:b/>
+          <w:color w:val="1A365D"/>
+          <w:sz w:val="24"/>
+        </w:rPr>
         <w:t>Curto - Médio</w:t>
       </w:r>
     </w:p>
     <w:p>
       <w:r>
+        <w:rPr>
+          <w:rFonts w:ascii="Arial" w:hAnsi="Arial"/>
+          <w:b/>
+          <w:color w:val="1A365D"/>
+          <w:sz w:val="24"/>
+        </w:rPr>
         <w:t>Baixo</w:t>
       </w:r>
     </w:p>
     <w:p>
       <w:r>
+        <w:rPr>
+          <w:rFonts w:ascii="Arial" w:hAnsi="Arial"/>
+          <w:b/>
+          <w:color w:val="1A365D"/>
+          <w:sz w:val="24"/>
+        </w:rPr>
         <w:t>Alta</w:t>
       </w:r>
     </w:p>
     <w:p>
       <w:r>
+        <w:rPr>
+          <w:rFonts w:ascii="Arial" w:hAnsi="Arial"/>
+          <w:b/>
+          <w:color w:val="1A365D"/>
+          <w:sz w:val="24"/>
+        </w:rPr>
         <w:t>Biotecnologia Marinha</w:t>
       </w:r>
     </w:p>
     <w:p>
       <w:r>
+        <w:rPr>
+          <w:rFonts w:ascii="Arial" w:hAnsi="Arial"/>
+          <w:b/>
+          <w:color w:val="1A365D"/>
+          <w:sz w:val="24"/>
+        </w:rPr>
         <w:t>Médio - Longo</w:t>
       </w:r>
     </w:p>
     <w:p>
       <w:r>
+        <w:rPr>
+          <w:rFonts w:ascii="Arial" w:hAnsi="Arial"/>
+          <w:b/>
+          <w:color w:val="1A365D"/>
+          <w:sz w:val="24"/>
+        </w:rPr>
         <w:t>Baixo</w:t>
       </w:r>
     </w:p>
     <w:p>
       <w:r>
+        <w:rPr>
+          <w:rFonts w:ascii="Arial" w:hAnsi="Arial"/>
+          <w:b/>
+          <w:color w:val="1A365D"/>
+          <w:sz w:val="24"/>
+        </w:rPr>
         <w:t>Alta</w:t>
       </w:r>
     </w:p>
     <w:p>
       <w:r>
+        <w:rPr>
+          <w:rFonts w:ascii="Arial" w:hAnsi="Arial"/>
+          <w:b/>
+          <w:color w:val="1A365D"/>
+          <w:sz w:val="24"/>
+        </w:rPr>
         <w:t>Deep-Sea Tech</w:t>
       </w:r>
     </w:p>
     <w:p>
       <w:r>
+        <w:rPr>
+          <w:rFonts w:ascii="Arial" w:hAnsi="Arial"/>
+          <w:b/>
+          <w:color w:val="1A365D"/>
+          <w:sz w:val="24"/>
+        </w:rPr>
         <w:t>Médio</w:t>
       </w:r>
     </w:p>
     <w:p>
       <w:r>
+        <w:rPr>
+          <w:rFonts w:ascii="Arial" w:hAnsi="Arial"/>
+          <w:b/>
+          <w:color w:val="1A365D"/>
+          <w:sz w:val="24"/>
+        </w:rPr>
         <w:t>Baixo</w:t>
       </w:r>
     </w:p>
     <w:p>
       <w:r>
+        <w:rPr>
+          <w:rFonts w:ascii="Arial" w:hAnsi="Arial"/>
+          <w:b/>
+          <w:color w:val="1A365D"/>
+          <w:sz w:val="24"/>
+        </w:rPr>
         <w:t>Alta</w:t>
       </w:r>
     </w:p>
     <w:p>
       <w:r>
+        <w:rPr>
+          <w:rFonts w:ascii="Arial" w:hAnsi="Arial"/>
+          <w:b/>
+          <w:color w:val="1A365D"/>
+          <w:sz w:val="24"/>
+        </w:rPr>
         <w:t>Mineração Mar Profundo</w:t>
       </w:r>
     </w:p>
     <w:p>
       <w:r>
+        <w:rPr>
+          <w:rFonts w:ascii="Arial" w:hAnsi="Arial"/>
+          <w:b/>
+          <w:color w:val="1A365D"/>
+          <w:sz w:val="24"/>
+        </w:rPr>
         <w:t>Longo</w:t>
       </w:r>
     </w:p>
     <w:p>
       <w:r>
+        <w:rPr>
+          <w:rFonts w:ascii="Arial" w:hAnsi="Arial"/>
+          <w:b/>
+          <w:color w:val="1A365D"/>
+          <w:sz w:val="24"/>
+        </w:rPr>
         <w:t>Elevado</w:t>
       </w:r>
     </w:p>
     <w:p>
       <w:r>
+        <w:rPr>
+          <w:rFonts w:ascii="Arial" w:hAnsi="Arial"/>
+          <w:b/>
+          <w:color w:val="1A365D"/>
+          <w:sz w:val="24"/>
+        </w:rPr>
         <w:t>Baixa</w:t>
       </w:r>
     </w:p>
     <w:p>
       <w:r>
+        <w:rPr>
+          <w:rFonts w:ascii="Arial" w:hAnsi="Arial"/>
+          <w:b/>
+          <w:color w:val="1A365D"/>
+          <w:sz w:val="24"/>
+        </w:rPr>
         <w:t>6. Roteiro proposto (adaptado ao contexto português)</w:t>
       </w:r>
     </w:p>
     <w:p>
+      <w:pPr>
+        <w:pStyle w:val="ListBullet"/>
+        <w:spacing w:line="276" w:lineRule="auto"/>
+        <w:jc w:val="both"/>
+      </w:pPr>
       <w:r>
-        <w:t>* Fase 1 (0 - 4 anos): Urban Mining com incentivos diretos e fiscalização digital.</w:t>
+        <w:rPr>
+          <w:rFonts w:ascii="Arial" w:hAnsi="Arial"/>
+          <w:color w:val="2D3748"/>
+          <w:sz w:val="24"/>
+        </w:rPr>
+        <w:t>Fase 1 (0 - 4 anos): Urban Mining com incentivos diretos e fiscalização digital.</w:t>
+      </w:r>
+    </w:p>
+    <w:p>
+      <w:pPr>
+        <w:pStyle w:val="ListBullet"/>
+        <w:spacing w:line="276" w:lineRule="auto"/>
+        <w:jc w:val="both"/>
+      </w:pPr>
+      <w:r>
+        <w:rPr>
+          <w:rFonts w:ascii="Arial" w:hAnsi="Arial"/>
+          <w:color w:val="2D3748"/>
+          <w:sz w:val="24"/>
+        </w:rPr>
+        <w:t>Fase 2 (2 - 6 anos): Cluster de Deep-Sea Tech e integração com defesa.</w:t>
+      </w:r>
+    </w:p>
+    <w:p>
+      <w:pPr>
+        <w:pStyle w:val="ListBullet"/>
+        <w:spacing w:line="276" w:lineRule="auto"/>
+        <w:jc w:val="both"/>
+      </w:pPr>
+      <w:r>
+        <w:rPr>
+          <w:rFonts w:ascii="Arial" w:hAnsi="Arial"/>
+          <w:color w:val="2D3748"/>
+          <w:sz w:val="24"/>
+        </w:rPr>
+        <w:t>Fase 3 (5 - 10 anos): Biotecnologia marinha com governação por marcos.</w:t>
+      </w:r>
+    </w:p>
+    <w:p>
+      <w:pPr>
+        <w:pStyle w:val="ListBullet"/>
+        <w:spacing w:line="276" w:lineRule="auto"/>
+        <w:jc w:val="both"/>
+      </w:pPr>
+      <w:r>
+        <w:rPr>
+          <w:rFonts w:ascii="Arial" w:hAnsi="Arial"/>
+          <w:color w:val="2D3748"/>
+          <w:sz w:val="24"/>
+        </w:rPr>
+        <w:t>Mineração comercial: apenas reavaliada após 2050, com consenso científico e político.</w:t>
       </w:r>
     </w:p>
     <w:p>
       <w:r>
-        <w:t>* Fase 2 (2 - 6 anos): Cluster de Deep-Sea Tech e integração com defesa.</w:t>
-      </w:r>
-    </w:p>
-    <w:p>
-      <w:r>
-        <w:t>* Fase 3 (5 - 10 anos): Biotecnologia marinha com governação por marcos.</w:t>
-      </w:r>
-    </w:p>
-    <w:p>
-      <w:r>
-        <w:t>* Mineração comercial: apenas reavaliada após 2050, com consenso científico e político.</w:t>
-      </w:r>
-    </w:p>
-    <w:p>
-      <w:r>
+        <w:rPr>
+          <w:rFonts w:ascii="Arial" w:hAnsi="Arial"/>
+          <w:b/>
+          <w:color w:val="1A365D"/>
+          <w:sz w:val="24"/>
+        </w:rPr>
         <w:t>7. Conclusão</w:t>
       </w:r>
     </w:p>
     <w:p>
+      <w:pPr>
+        <w:spacing w:line="276" w:lineRule="auto"/>
+        <w:jc w:val="both"/>
+      </w:pPr>
       <w:r>
+        <w:rPr>
+          <w:rFonts w:ascii="Arial" w:hAnsi="Arial"/>
+          <w:color w:val="2D3748"/>
+          <w:sz w:val="24"/>
+        </w:rPr>
         <w:t>Portugal não precisa de destruir o mar para beneficiar dele. Ao priorizar alternativas tecnológicas e industriais, o UNIR propõe um caminho mais rápido, seguro e alinhado com os valores e hábitos do país. Este Anexo reforça o Eixo I como uma estratégia de soberania moderna, responsável e eficaz.</w:t>
       </w:r>
     </w:p>
     <w:sectPr>
       <w:pgSz w:w="12240" w:h="15840"/>
-      <w:pgMar w:top="1440" w:right="1800" w:bottom="1440" w:left="1800" w:header="720" w:footer="720" w:gutter="0"/>
+      <w:pgMar w:top="1440" w:right="1440" w:bottom="1440" w:left="1440" w:header="720" w:footer="720" w:gutter="0"/>
       <w:cols w:space="720"/>
       <w:docGrid w:linePitch="360"/>
     </w:sectPr>
@@ -780,9 +1430,14 @@
     <w:name w:val="Normal"/>
     <w:qFormat/>
     <w:rsid w:val="00FC693F"/>
+    <w:pPr>
+      <w:spacing w:line="276" w:lineRule="auto"/>
+      <w:jc w:val="both"/>
+    </w:pPr>
     <w:rPr>
-      <w:rFonts w:ascii="Calibri" w:hAnsi="Calibri"/>
-      <w:sz w:val="22"/>
+      <w:rFonts w:ascii="Arial" w:hAnsi="Arial"/>
+      <w:color w:val="2D3748"/>
+      <w:sz w:val="24"/>
     </w:rPr>
   </w:style>
   <w:style w:type="paragraph" w:styleId="Header">
@@ -844,11 +1499,11 @@
       <w:outlineLvl w:val="0"/>
     </w:pPr>
     <w:rPr>
-      <w:rFonts w:asciiTheme="majorHAnsi" w:eastAsiaTheme="majorEastAsia" w:hAnsiTheme="majorHAnsi" w:cstheme="majorBidi"/>
+      <w:rFonts w:asciiTheme="majorHAnsi" w:eastAsiaTheme="majorEastAsia" w:hAnsiTheme="majorHAnsi" w:cstheme="majorBidi" w:ascii="Arial" w:hAnsi="Arial"/>
       <w:b/>
       <w:bCs/>
-      <w:color w:val="365F91" w:themeColor="accent1" w:themeShade="BF"/>
-      <w:sz w:val="28"/>
+      <w:color w:val="1A365D"/>
+      <w:sz w:val="48"/>
       <w:szCs w:val="28"/>
     </w:rPr>
   </w:style>
@@ -868,11 +1523,11 @@
       <w:outlineLvl w:val="1"/>
     </w:pPr>
     <w:rPr>
-      <w:rFonts w:asciiTheme="majorHAnsi" w:eastAsiaTheme="majorEastAsia" w:hAnsiTheme="majorHAnsi" w:cstheme="majorBidi"/>
+      <w:rFonts w:asciiTheme="majorHAnsi" w:eastAsiaTheme="majorEastAsia" w:hAnsiTheme="majorHAnsi" w:cstheme="majorBidi" w:ascii="Arial" w:hAnsi="Arial"/>
       <w:b/>
       <w:bCs/>
-      <w:color w:val="4F81BD" w:themeColor="accent1"/>
-      <w:sz w:val="26"/>
+      <w:color w:val="1A365D"/>
+      <w:sz w:val="36"/>
       <w:szCs w:val="26"/>
     </w:rPr>
   </w:style>
@@ -892,10 +1547,11 @@
       <w:outlineLvl w:val="2"/>
     </w:pPr>
     <w:rPr>
-      <w:rFonts w:asciiTheme="majorHAnsi" w:eastAsiaTheme="majorEastAsia" w:hAnsiTheme="majorHAnsi" w:cstheme="majorBidi"/>
+      <w:rFonts w:asciiTheme="majorHAnsi" w:eastAsiaTheme="majorEastAsia" w:hAnsiTheme="majorHAnsi" w:cstheme="majorBidi" w:ascii="Arial" w:hAnsi="Arial"/>
       <w:b/>
       <w:bCs/>
-      <w:color w:val="4F81BD" w:themeColor="accent1"/>
+      <w:color w:val="1A365D"/>
+      <w:sz w:val="28"/>
     </w:rPr>
   </w:style>
   <w:style w:type="paragraph" w:styleId="Heading4">

</xml_diff>